<commit_message>
Update Semester 1 DOCX files
Modified three Semester 1 Word documents: IPA/CATATAN IPA BAB 1.docx, IPA/LATIHAN SOAL IPA BAB 1.docx, and PPKN/Pembukaan UUD NRI 1945.docx to update notes and exercise content.
</commit_message>
<xml_diff>
--- a/jasonpieterkwork/PPKN/SEMESTER 1/Pembukaan UUD NRI 1945.docx
+++ b/jasonpieterkwork/PPKN/SEMESTER 1/Pembukaan UUD NRI 1945.docx
@@ -12,7 +12,7 @@
         <w:rPr>
           <w:rFonts w:ascii="Balsamiq Sans" w:hAnsi="Balsamiq Sans"/>
         </w:rPr>
-        <w:t xml:space="preserve">Pembukaan Bahwa sesungguhnya kemerdekaan itu ialah hak segala bangsa dan oleh sebab itu, maka penjajahan diatas dunia harus dihapuskan, karena tidak sesuai dengan perikemanusiaan dan perikeadilan. </w:t>
+        <w:t xml:space="preserve">Bahwa sesungguhnya kemerdekaan itu ialah hak segala bangsa dan oleh sebab itu, maka penjajahan diatas dunia harus dihapuskan, karena tidak sesuai dengan perikemanusiaan dan perikeadilan. </w:t>
       </w:r>
     </w:p>
     <w:p>
@@ -982,6 +982,7 @@
   <w:style w:type="character" w:default="1" w:styleId="DefaultParagraphFont">
     <w:name w:val="Default Paragraph Font"/>
     <w:uiPriority w:val="1"/>
+    <w:semiHidden/>
     <w:unhideWhenUsed/>
   </w:style>
   <w:style w:type="table" w:default="1" w:styleId="TableNormal">
@@ -1493,9 +1494,11 @@
   </w:compat>
   <w:rsids>
     <w:rsidRoot w:val="00DF2FE0"/>
+    <w:rsid w:val="00382872"/>
     <w:rsid w:val="005704F6"/>
     <w:rsid w:val="00597C41"/>
     <w:rsid w:val="006966E0"/>
+    <w:rsid w:val="006D6C82"/>
     <w:rsid w:val="00713F88"/>
     <w:rsid w:val="00725C84"/>
     <w:rsid w:val="007F1D03"/>

</xml_diff>